<commit_message>
auto: session end commit
</commit_message>
<xml_diff>
--- a/docs/delivery/개발완료보고서.docx
+++ b/docs/delivery/개발완료보고서.docx
@@ -2,7 +2,7 @@
 <file path=word/document.xml><?xml version="1.0" encoding="utf-8"?>
 <w:document xmlns:w="http://schemas.openxmlformats.org/wordprocessingml/2006/main" xmlns:m="http://schemas.openxmlformats.org/officeDocument/2006/math" xmlns:r="http://schemas.openxmlformats.org/officeDocument/2006/relationships" xmlns:o="urn:schemas-microsoft-com:office:office" xmlns:v="urn:schemas-microsoft-com:vml" xmlns:w10="urn:schemas-microsoft-com:office:word" xmlns:a="http://schemas.openxmlformats.org/drawingml/2006/main" xmlns:pic="http://schemas.openxmlformats.org/drawingml/2006/picture" xmlns:wp="http://schemas.openxmlformats.org/drawingml/2006/wordprocessingDrawing">
   <w:body>
-    <w:bookmarkStart w:id="30" w:name="개발-완료-보고서"/>
+    <w:bookmarkStart w:id="63" w:name="개발-완료-보고서"/>
     <w:p>
       <w:pPr>
         <w:pStyle w:val="Heading1"/>
@@ -4411,13 +4411,606 @@
       </w:r>
     </w:p>
     <w:bookmarkEnd w:id="28"/>
-    <w:bookmarkStart w:id="29" w:name="확인"/>
+    <w:bookmarkStart w:id="61" w:name="주요-화면-캡처"/>
     <w:p>
       <w:pPr>
         <w:pStyle w:val="Heading2"/>
       </w:pPr>
       <w:r>
-        <w:t xml:space="preserve">10. 확인</w:t>
+        <w:t xml:space="preserve">10. 주요 화면 캡처</w:t>
+      </w:r>
+    </w:p>
+    <w:bookmarkStart w:id="32" w:name="사용자-앱-모바일-로그인-otp-인증"/>
+    <w:p>
+      <w:pPr>
+        <w:pStyle w:val="Heading3"/>
+      </w:pPr>
+      <w:r>
+        <w:t xml:space="preserve">10.1 사용자 앱 — 모바일 로그인 (OTP 인증)</w:t>
+      </w:r>
+    </w:p>
+    <w:p>
+      <w:pPr>
+        <w:pStyle w:val="CaptionedFigure"/>
+      </w:pPr>
+      <w:r>
+        <w:drawing>
+          <wp:inline>
+            <wp:extent cx="6324600" cy="3180609"/>
+            <wp:effectExtent b="0" l="0" r="0" t="0"/>
+            <wp:docPr descr="모바일 로그인" title="" id="30" name="Picture"/>
+            <a:graphic>
+              <a:graphicData uri="http://schemas.openxmlformats.org/drawingml/2006/picture">
+                <pic:pic>
+                  <pic:nvPicPr>
+                    <pic:cNvPr descr="screenshots/08_mobile_login.jpg" id="31" name="Picture"/>
+                    <pic:cNvPicPr>
+                      <a:picLocks noChangeArrowheads="1" noChangeAspect="1"/>
+                    </pic:cNvPicPr>
+                  </pic:nvPicPr>
+                  <pic:blipFill>
+                    <a:blip r:embed="rId29"/>
+                    <a:stretch>
+                      <a:fillRect/>
+                    </a:stretch>
+                  </pic:blipFill>
+                  <pic:spPr bwMode="auto">
+                    <a:xfrm>
+                      <a:off x="0" y="0"/>
+                      <a:ext cx="6324600" cy="3180609"/>
+                    </a:xfrm>
+                    <a:prstGeom prst="rect">
+                      <a:avLst/>
+                    </a:prstGeom>
+                    <a:noFill/>
+                    <a:ln w="9525">
+                      <a:noFill/>
+                      <a:headEnd/>
+                      <a:tailEnd/>
+                    </a:ln>
+                  </pic:spPr>
+                </pic:pic>
+              </a:graphicData>
+            </a:graphic>
+          </wp:inline>
+        </w:drawing>
+      </w:r>
+    </w:p>
+    <w:p>
+      <w:pPr>
+        <w:pStyle w:val="ImageCaption"/>
+      </w:pPr>
+      <w:r>
+        <w:t xml:space="preserve">모바일 로그인</w:t>
+      </w:r>
+    </w:p>
+    <w:bookmarkEnd w:id="32"/>
+    <w:bookmarkStart w:id="36" w:name="관리자-콘솔-운영-상태"/>
+    <w:p>
+      <w:pPr>
+        <w:pStyle w:val="Heading3"/>
+      </w:pPr>
+      <w:r>
+        <w:t xml:space="preserve">10.2 관리자 콘솔 — 운영 상태</w:t>
+      </w:r>
+    </w:p>
+    <w:p>
+      <w:pPr>
+        <w:pStyle w:val="FirstParagraph"/>
+      </w:pPr>
+      <w:r>
+        <w:t xml:space="preserve">알림 발송, 알림 스케줄 설정, 브랜딩(마스코트/설문) 관리 화면입니다.</w:t>
+      </w:r>
+    </w:p>
+    <w:p>
+      <w:pPr>
+        <w:pStyle w:val="CaptionedFigure"/>
+      </w:pPr>
+      <w:r>
+        <w:drawing>
+          <wp:inline>
+            <wp:extent cx="6324600" cy="9583678"/>
+            <wp:effectExtent b="0" l="0" r="0" t="0"/>
+            <wp:docPr descr="운영 상태" title="" id="34" name="Picture"/>
+            <a:graphic>
+              <a:graphicData uri="http://schemas.openxmlformats.org/drawingml/2006/picture">
+                <pic:pic>
+                  <pic:nvPicPr>
+                    <pic:cNvPr descr="screenshots/01_operations.jpg" id="35" name="Picture"/>
+                    <pic:cNvPicPr>
+                      <a:picLocks noChangeArrowheads="1" noChangeAspect="1"/>
+                    </pic:cNvPicPr>
+                  </pic:nvPicPr>
+                  <pic:blipFill>
+                    <a:blip r:embed="rId33"/>
+                    <a:stretch>
+                      <a:fillRect/>
+                    </a:stretch>
+                  </pic:blipFill>
+                  <pic:spPr bwMode="auto">
+                    <a:xfrm>
+                      <a:off x="0" y="0"/>
+                      <a:ext cx="6324600" cy="9583678"/>
+                    </a:xfrm>
+                    <a:prstGeom prst="rect">
+                      <a:avLst/>
+                    </a:prstGeom>
+                    <a:noFill/>
+                    <a:ln w="9525">
+                      <a:noFill/>
+                      <a:headEnd/>
+                      <a:tailEnd/>
+                    </a:ln>
+                  </pic:spPr>
+                </pic:pic>
+              </a:graphicData>
+            </a:graphic>
+          </wp:inline>
+        </w:drawing>
+      </w:r>
+    </w:p>
+    <w:p>
+      <w:pPr>
+        <w:pStyle w:val="ImageCaption"/>
+      </w:pPr>
+      <w:r>
+        <w:t xml:space="preserve">운영 상태</w:t>
+      </w:r>
+    </w:p>
+    <w:bookmarkEnd w:id="36"/>
+    <w:bookmarkStart w:id="40" w:name="관리자-콘솔-계정-관리"/>
+    <w:p>
+      <w:pPr>
+        <w:pStyle w:val="Heading3"/>
+      </w:pPr>
+      <w:r>
+        <w:t xml:space="preserve">10.3 관리자 콘솔 — 계정 관리</w:t>
+      </w:r>
+    </w:p>
+    <w:p>
+      <w:pPr>
+        <w:pStyle w:val="FirstParagraph"/>
+      </w:pPr>
+      <w:r>
+        <w:t xml:space="preserve">사용자 검색, 전화번호 변경, 세션 초기화, 사용 중단/재개 기능입니다.</w:t>
+      </w:r>
+    </w:p>
+    <w:p>
+      <w:pPr>
+        <w:pStyle w:val="CaptionedFigure"/>
+      </w:pPr>
+      <w:r>
+        <w:drawing>
+          <wp:inline>
+            <wp:extent cx="6324600" cy="3180609"/>
+            <wp:effectExtent b="0" l="0" r="0" t="0"/>
+            <wp:docPr descr="계정 관리" title="" id="38" name="Picture"/>
+            <a:graphic>
+              <a:graphicData uri="http://schemas.openxmlformats.org/drawingml/2006/picture">
+                <pic:pic>
+                  <pic:nvPicPr>
+                    <pic:cNvPr descr="screenshots/02_accounts.jpg" id="39" name="Picture"/>
+                    <pic:cNvPicPr>
+                      <a:picLocks noChangeArrowheads="1" noChangeAspect="1"/>
+                    </pic:cNvPicPr>
+                  </pic:nvPicPr>
+                  <pic:blipFill>
+                    <a:blip r:embed="rId37"/>
+                    <a:stretch>
+                      <a:fillRect/>
+                    </a:stretch>
+                  </pic:blipFill>
+                  <pic:spPr bwMode="auto">
+                    <a:xfrm>
+                      <a:off x="0" y="0"/>
+                      <a:ext cx="6324600" cy="3180609"/>
+                    </a:xfrm>
+                    <a:prstGeom prst="rect">
+                      <a:avLst/>
+                    </a:prstGeom>
+                    <a:noFill/>
+                    <a:ln w="9525">
+                      <a:noFill/>
+                      <a:headEnd/>
+                      <a:tailEnd/>
+                    </a:ln>
+                  </pic:spPr>
+                </pic:pic>
+              </a:graphicData>
+            </a:graphic>
+          </wp:inline>
+        </w:drawing>
+      </w:r>
+    </w:p>
+    <w:p>
+      <w:pPr>
+        <w:pStyle w:val="ImageCaption"/>
+      </w:pPr>
+      <w:r>
+        <w:t xml:space="preserve">계정 관리</w:t>
+      </w:r>
+    </w:p>
+    <w:bookmarkEnd w:id="40"/>
+    <w:bookmarkStart w:id="44" w:name="관리자-콘솔-참조-파일-rag-문서"/>
+    <w:p>
+      <w:pPr>
+        <w:pStyle w:val="Heading3"/>
+      </w:pPr>
+      <w:r>
+        <w:t xml:space="preserve">10.4 관리자 콘솔 — 참조 파일 (RAG 문서)</w:t>
+      </w:r>
+    </w:p>
+    <w:p>
+      <w:pPr>
+        <w:pStyle w:val="FirstParagraph"/>
+      </w:pPr>
+      <w:r>
+        <w:t xml:space="preserve">PDF/DOCX 파일 업로드 및 지식 문서 관리 화면입니다.</w:t>
+      </w:r>
+    </w:p>
+    <w:p>
+      <w:pPr>
+        <w:pStyle w:val="CaptionedFigure"/>
+      </w:pPr>
+      <w:r>
+        <w:drawing>
+          <wp:inline>
+            <wp:extent cx="6324600" cy="44884258"/>
+            <wp:effectExtent b="0" l="0" r="0" t="0"/>
+            <wp:docPr descr="참조 파일" title="" id="42" name="Picture"/>
+            <a:graphic>
+              <a:graphicData uri="http://schemas.openxmlformats.org/drawingml/2006/picture">
+                <pic:pic>
+                  <pic:nvPicPr>
+                    <pic:cNvPr descr="screenshots/03_documents.jpg" id="43" name="Picture"/>
+                    <pic:cNvPicPr>
+                      <a:picLocks noChangeArrowheads="1" noChangeAspect="1"/>
+                    </pic:cNvPicPr>
+                  </pic:nvPicPr>
+                  <pic:blipFill>
+                    <a:blip r:embed="rId41"/>
+                    <a:stretch>
+                      <a:fillRect/>
+                    </a:stretch>
+                  </pic:blipFill>
+                  <pic:spPr bwMode="auto">
+                    <a:xfrm>
+                      <a:off x="0" y="0"/>
+                      <a:ext cx="6324600" cy="44884258"/>
+                    </a:xfrm>
+                    <a:prstGeom prst="rect">
+                      <a:avLst/>
+                    </a:prstGeom>
+                    <a:noFill/>
+                    <a:ln w="9525">
+                      <a:noFill/>
+                      <a:headEnd/>
+                      <a:tailEnd/>
+                    </a:ln>
+                  </pic:spPr>
+                </pic:pic>
+              </a:graphicData>
+            </a:graphic>
+          </wp:inline>
+        </w:drawing>
+      </w:r>
+    </w:p>
+    <w:p>
+      <w:pPr>
+        <w:pStyle w:val="ImageCaption"/>
+      </w:pPr>
+      <w:r>
+        <w:t xml:space="preserve">참조 파일</w:t>
+      </w:r>
+    </w:p>
+    <w:bookmarkEnd w:id="44"/>
+    <w:bookmarkStart w:id="48" w:name="관리자-콘솔-지식-콘텐츠"/>
+    <w:p>
+      <w:pPr>
+        <w:pStyle w:val="Heading3"/>
+      </w:pPr>
+      <w:r>
+        <w:t xml:space="preserve">10.5 관리자 콘솔 — 지식 콘텐츠</w:t>
+      </w:r>
+    </w:p>
+    <w:p>
+      <w:pPr>
+        <w:pStyle w:val="FirstParagraph"/>
+      </w:pPr>
+      <w:r>
+        <w:t xml:space="preserve">주차별 고정 안내문 관리 화면입니다.</w:t>
+      </w:r>
+    </w:p>
+    <w:p>
+      <w:pPr>
+        <w:pStyle w:val="CaptionedFigure"/>
+      </w:pPr>
+      <w:r>
+        <w:drawing>
+          <wp:inline>
+            <wp:extent cx="6324600" cy="3180609"/>
+            <wp:effectExtent b="0" l="0" r="0" t="0"/>
+            <wp:docPr descr="지식 콘텐츠" title="" id="46" name="Picture"/>
+            <a:graphic>
+              <a:graphicData uri="http://schemas.openxmlformats.org/drawingml/2006/picture">
+                <pic:pic>
+                  <pic:nvPicPr>
+                    <pic:cNvPr descr="screenshots/04_static.jpg" id="47" name="Picture"/>
+                    <pic:cNvPicPr>
+                      <a:picLocks noChangeArrowheads="1" noChangeAspect="1"/>
+                    </pic:cNvPicPr>
+                  </pic:nvPicPr>
+                  <pic:blipFill>
+                    <a:blip r:embed="rId45"/>
+                    <a:stretch>
+                      <a:fillRect/>
+                    </a:stretch>
+                  </pic:blipFill>
+                  <pic:spPr bwMode="auto">
+                    <a:xfrm>
+                      <a:off x="0" y="0"/>
+                      <a:ext cx="6324600" cy="3180609"/>
+                    </a:xfrm>
+                    <a:prstGeom prst="rect">
+                      <a:avLst/>
+                    </a:prstGeom>
+                    <a:noFill/>
+                    <a:ln w="9525">
+                      <a:noFill/>
+                      <a:headEnd/>
+                      <a:tailEnd/>
+                    </a:ln>
+                  </pic:spPr>
+                </pic:pic>
+              </a:graphicData>
+            </a:graphic>
+          </wp:inline>
+        </w:drawing>
+      </w:r>
+    </w:p>
+    <w:p>
+      <w:pPr>
+        <w:pStyle w:val="ImageCaption"/>
+      </w:pPr>
+      <w:r>
+        <w:t xml:space="preserve">지식 콘텐츠</w:t>
+      </w:r>
+    </w:p>
+    <w:bookmarkEnd w:id="48"/>
+    <w:bookmarkStart w:id="52" w:name="관리자-콘솔-주차별-아기는요"/>
+    <w:p>
+      <w:pPr>
+        <w:pStyle w:val="Heading3"/>
+      </w:pPr>
+      <w:r>
+        <w:t xml:space="preserve">10.6 관리자 콘솔 — 주차별 아기는요?</w:t>
+      </w:r>
+    </w:p>
+    <w:p>
+      <w:pPr>
+        <w:pStyle w:val="FirstParagraph"/>
+      </w:pPr>
+      <w:r>
+        <w:t xml:space="preserve">임신 5~40주차 콘텐츠 관리 (아기/엄마 정보, 체크리스트, 질문, 이미지)입니다.</w:t>
+      </w:r>
+    </w:p>
+    <w:p>
+      <w:pPr>
+        <w:pStyle w:val="CaptionedFigure"/>
+      </w:pPr>
+      <w:r>
+        <w:drawing>
+          <wp:inline>
+            <wp:extent cx="6324600" cy="10342211"/>
+            <wp:effectExtent b="0" l="0" r="0" t="0"/>
+            <wp:docPr descr="주차별 아기는요" title="" id="50" name="Picture"/>
+            <a:graphic>
+              <a:graphicData uri="http://schemas.openxmlformats.org/drawingml/2006/picture">
+                <pic:pic>
+                  <pic:nvPicPr>
+                    <pic:cNvPr descr="screenshots/05_weeks.jpg" id="51" name="Picture"/>
+                    <pic:cNvPicPr>
+                      <a:picLocks noChangeArrowheads="1" noChangeAspect="1"/>
+                    </pic:cNvPicPr>
+                  </pic:nvPicPr>
+                  <pic:blipFill>
+                    <a:blip r:embed="rId49"/>
+                    <a:stretch>
+                      <a:fillRect/>
+                    </a:stretch>
+                  </pic:blipFill>
+                  <pic:spPr bwMode="auto">
+                    <a:xfrm>
+                      <a:off x="0" y="0"/>
+                      <a:ext cx="6324600" cy="10342211"/>
+                    </a:xfrm>
+                    <a:prstGeom prst="rect">
+                      <a:avLst/>
+                    </a:prstGeom>
+                    <a:noFill/>
+                    <a:ln w="9525">
+                      <a:noFill/>
+                      <a:headEnd/>
+                      <a:tailEnd/>
+                    </a:ln>
+                  </pic:spPr>
+                </pic:pic>
+              </a:graphicData>
+            </a:graphic>
+          </wp:inline>
+        </w:drawing>
+      </w:r>
+    </w:p>
+    <w:p>
+      <w:pPr>
+        <w:pStyle w:val="ImageCaption"/>
+      </w:pPr>
+      <w:r>
+        <w:t xml:space="preserve">주차별 아기는요</w:t>
+      </w:r>
+    </w:p>
+    <w:bookmarkEnd w:id="52"/>
+    <w:bookmarkStart w:id="56" w:name="관리자-콘솔-응답-워크플로우"/>
+    <w:p>
+      <w:pPr>
+        <w:pStyle w:val="Heading3"/>
+      </w:pPr>
+      <w:r>
+        <w:t xml:space="preserve">10.7 관리자 콘솔 — 응답 워크플로우</w:t>
+      </w:r>
+    </w:p>
+    <w:p>
+      <w:pPr>
+        <w:pStyle w:val="FirstParagraph"/>
+      </w:pPr>
+      <w:r>
+        <w:t xml:space="preserve">AI 응답 워크플로우 설정 및 테스트 실행 화면입니다.</w:t>
+      </w:r>
+    </w:p>
+    <w:p>
+      <w:pPr>
+        <w:pStyle w:val="CaptionedFigure"/>
+      </w:pPr>
+      <w:r>
+        <w:drawing>
+          <wp:inline>
+            <wp:extent cx="6324600" cy="3180609"/>
+            <wp:effectExtent b="0" l="0" r="0" t="0"/>
+            <wp:docPr descr="응답 워크플로우" title="" id="54" name="Picture"/>
+            <a:graphic>
+              <a:graphicData uri="http://schemas.openxmlformats.org/drawingml/2006/picture">
+                <pic:pic>
+                  <pic:nvPicPr>
+                    <pic:cNvPr descr="screenshots/06_policies.jpg" id="55" name="Picture"/>
+                    <pic:cNvPicPr>
+                      <a:picLocks noChangeArrowheads="1" noChangeAspect="1"/>
+                    </pic:cNvPicPr>
+                  </pic:nvPicPr>
+                  <pic:blipFill>
+                    <a:blip r:embed="rId53"/>
+                    <a:stretch>
+                      <a:fillRect/>
+                    </a:stretch>
+                  </pic:blipFill>
+                  <pic:spPr bwMode="auto">
+                    <a:xfrm>
+                      <a:off x="0" y="0"/>
+                      <a:ext cx="6324600" cy="3180609"/>
+                    </a:xfrm>
+                    <a:prstGeom prst="rect">
+                      <a:avLst/>
+                    </a:prstGeom>
+                    <a:noFill/>
+                    <a:ln w="9525">
+                      <a:noFill/>
+                      <a:headEnd/>
+                      <a:tailEnd/>
+                    </a:ln>
+                  </pic:spPr>
+                </pic:pic>
+              </a:graphicData>
+            </a:graphic>
+          </wp:inline>
+        </w:drawing>
+      </w:r>
+    </w:p>
+    <w:p>
+      <w:pPr>
+        <w:pStyle w:val="ImageCaption"/>
+      </w:pPr>
+      <w:r>
+        <w:t xml:space="preserve">응답 워크플로우</w:t>
+      </w:r>
+    </w:p>
+    <w:bookmarkEnd w:id="56"/>
+    <w:bookmarkStart w:id="60" w:name="관리자-콘솔-모니터링"/>
+    <w:p>
+      <w:pPr>
+        <w:pStyle w:val="Heading3"/>
+      </w:pPr>
+      <w:r>
+        <w:t xml:space="preserve">10.8 관리자 콘솔 — 모니터링</w:t>
+      </w:r>
+    </w:p>
+    <w:p>
+      <w:pPr>
+        <w:pStyle w:val="FirstParagraph"/>
+      </w:pPr>
+      <w:r>
+        <w:t xml:space="preserve">실시간 사용자 이벤트 및 채팅 세션 감사 화면입니다.</w:t>
+      </w:r>
+    </w:p>
+    <w:p>
+      <w:pPr>
+        <w:pStyle w:val="CaptionedFigure"/>
+      </w:pPr>
+      <w:r>
+        <w:drawing>
+          <wp:inline>
+            <wp:extent cx="6324600" cy="6947120"/>
+            <wp:effectExtent b="0" l="0" r="0" t="0"/>
+            <wp:docPr descr="모니터링" title="" id="58" name="Picture"/>
+            <a:graphic>
+              <a:graphicData uri="http://schemas.openxmlformats.org/drawingml/2006/picture">
+                <pic:pic>
+                  <pic:nvPicPr>
+                    <pic:cNvPr descr="screenshots/07_monitoring.jpg" id="59" name="Picture"/>
+                    <pic:cNvPicPr>
+                      <a:picLocks noChangeArrowheads="1" noChangeAspect="1"/>
+                    </pic:cNvPicPr>
+                  </pic:nvPicPr>
+                  <pic:blipFill>
+                    <a:blip r:embed="rId57"/>
+                    <a:stretch>
+                      <a:fillRect/>
+                    </a:stretch>
+                  </pic:blipFill>
+                  <pic:spPr bwMode="auto">
+                    <a:xfrm>
+                      <a:off x="0" y="0"/>
+                      <a:ext cx="6324600" cy="6947120"/>
+                    </a:xfrm>
+                    <a:prstGeom prst="rect">
+                      <a:avLst/>
+                    </a:prstGeom>
+                    <a:noFill/>
+                    <a:ln w="9525">
+                      <a:noFill/>
+                      <a:headEnd/>
+                      <a:tailEnd/>
+                    </a:ln>
+                  </pic:spPr>
+                </pic:pic>
+              </a:graphicData>
+            </a:graphic>
+          </wp:inline>
+        </w:drawing>
+      </w:r>
+    </w:p>
+    <w:p>
+      <w:pPr>
+        <w:pStyle w:val="ImageCaption"/>
+      </w:pPr>
+      <w:r>
+        <w:t xml:space="preserve">모니터링</w:t>
+      </w:r>
+    </w:p>
+    <w:p>
+      <w:r>
+        <w:pict>
+          <v:rect style="width:0;height:1.5pt" o:hralign="center" o:hrstd="t" o:hr="t"/>
+        </w:pict>
+      </w:r>
+    </w:p>
+    <w:bookmarkEnd w:id="60"/>
+    <w:bookmarkEnd w:id="61"/>
+    <w:bookmarkStart w:id="62" w:name="확인"/>
+    <w:p>
+      <w:pPr>
+        <w:pStyle w:val="Heading2"/>
+      </w:pPr>
+      <w:r>
+        <w:t xml:space="preserve">11. 확인</w:t>
       </w:r>
     </w:p>
     <w:tbl>
@@ -4568,8 +5161,8 @@
         </w:tc>
       </w:tr>
     </w:tbl>
-    <w:bookmarkEnd w:id="29"/>
-    <w:bookmarkEnd w:id="30"/>
+    <w:bookmarkEnd w:id="62"/>
+    <w:bookmarkEnd w:id="63"/>
     <w:sectPr>
       <w:pgSz w:h="15840" w:w="12240"/>
       <w:pgMar w:bottom="1134" w:footer="720" w:gutter="0" w:header="720" w:left="1134" w:right="1134" w:top="1134"/>

</xml_diff>